<commit_message>
Update Seminar Fantasy league MongoDB document
</commit_message>
<xml_diff>
--- a/docs/Seminar-Fantasy-liga-MongoDB.docx
+++ b/docs/Seminar-Fantasy-liga-MongoDB.docx
@@ -298,7 +298,7 @@
       <w:r>
         <w:fldChar w:fldCharType="separate"/>
       </w:r>
-      <w:hyperlink w:anchor="_Toc233135223" w:history="1">
+      <w:hyperlink w:anchor="_Toc233140911" w:history="1">
         <w:r>
           <w:rPr>
             <w:rStyle w:val="Hyperlink"/>
@@ -325,7 +325,7 @@
             <w:noProof/>
             <w:webHidden/>
           </w:rPr>
-          <w:instrText xml:space="preserve"> PAGEREF _Toc233135223 \h </w:instrText>
+          <w:instrText xml:space="preserve"> PAGEREF _Toc233140911 \h </w:instrText>
         </w:r>
         <w:r>
           <w:rPr>
@@ -370,7 +370,7 @@
           <w:lang w:val="en-HR" w:eastAsia="en-GB"/>
         </w:rPr>
       </w:pPr>
-      <w:hyperlink w:anchor="_Toc233135224" w:history="1">
+      <w:hyperlink w:anchor="_Toc233140912" w:history="1">
         <w:r>
           <w:rPr>
             <w:rStyle w:val="Hyperlink"/>
@@ -413,7 +413,7 @@
             <w:noProof/>
             <w:webHidden/>
           </w:rPr>
-          <w:instrText xml:space="preserve"> PAGEREF _Toc233135224 \h </w:instrText>
+          <w:instrText xml:space="preserve"> PAGEREF _Toc233140912 \h </w:instrText>
         </w:r>
         <w:r>
           <w:rPr>
@@ -458,7 +458,7 @@
           <w:lang w:val="en-HR" w:eastAsia="en-GB"/>
         </w:rPr>
       </w:pPr>
-      <w:hyperlink w:anchor="_Toc233135225" w:history="1">
+      <w:hyperlink w:anchor="_Toc233140913" w:history="1">
         <w:r>
           <w:rPr>
             <w:rStyle w:val="Hyperlink"/>
@@ -501,7 +501,7 @@
             <w:noProof/>
             <w:webHidden/>
           </w:rPr>
-          <w:instrText xml:space="preserve"> PAGEREF _Toc233135225 \h </w:instrText>
+          <w:instrText xml:space="preserve"> PAGEREF _Toc233140913 \h </w:instrText>
         </w:r>
         <w:r>
           <w:rPr>
@@ -546,7 +546,7 @@
           <w:lang w:val="en-HR" w:eastAsia="en-GB"/>
         </w:rPr>
       </w:pPr>
-      <w:hyperlink w:anchor="_Toc233135226" w:history="1">
+      <w:hyperlink w:anchor="_Toc233140914" w:history="1">
         <w:r>
           <w:rPr>
             <w:rStyle w:val="Hyperlink"/>
@@ -589,7 +589,7 @@
             <w:noProof/>
             <w:webHidden/>
           </w:rPr>
-          <w:instrText xml:space="preserve"> PAGEREF _Toc233135226 \h </w:instrText>
+          <w:instrText xml:space="preserve"> PAGEREF _Toc233140914 \h </w:instrText>
         </w:r>
         <w:r>
           <w:rPr>
@@ -634,7 +634,7 @@
           <w:lang w:val="en-HR" w:eastAsia="en-GB"/>
         </w:rPr>
       </w:pPr>
-      <w:hyperlink w:anchor="_Toc233135227" w:history="1">
+      <w:hyperlink w:anchor="_Toc233140915" w:history="1">
         <w:r>
           <w:rPr>
             <w:rStyle w:val="Hyperlink"/>
@@ -677,7 +677,7 @@
             <w:noProof/>
             <w:webHidden/>
           </w:rPr>
-          <w:instrText xml:space="preserve"> PAGEREF _Toc233135227 \h </w:instrText>
+          <w:instrText xml:space="preserve"> PAGEREF _Toc233140915 \h </w:instrText>
         </w:r>
         <w:r>
           <w:rPr>
@@ -722,7 +722,7 @@
           <w:lang w:val="en-HR" w:eastAsia="en-GB"/>
         </w:rPr>
       </w:pPr>
-      <w:hyperlink w:anchor="_Toc233135228" w:history="1">
+      <w:hyperlink w:anchor="_Toc233140916" w:history="1">
         <w:r>
           <w:rPr>
             <w:rStyle w:val="Hyperlink"/>
@@ -765,7 +765,7 @@
             <w:noProof/>
             <w:webHidden/>
           </w:rPr>
-          <w:instrText xml:space="preserve"> PAGEREF _Toc233135228 \h </w:instrText>
+          <w:instrText xml:space="preserve"> PAGEREF _Toc233140916 \h </w:instrText>
         </w:r>
         <w:r>
           <w:rPr>
@@ -810,7 +810,7 @@
           <w:lang w:val="en-HR" w:eastAsia="en-GB"/>
         </w:rPr>
       </w:pPr>
-      <w:hyperlink w:anchor="_Toc233135229" w:history="1">
+      <w:hyperlink w:anchor="_Toc233140917" w:history="1">
         <w:r>
           <w:rPr>
             <w:rStyle w:val="Hyperlink"/>
@@ -853,7 +853,7 @@
             <w:noProof/>
             <w:webHidden/>
           </w:rPr>
-          <w:instrText xml:space="preserve"> PAGEREF _Toc233135229 \h </w:instrText>
+          <w:instrText xml:space="preserve"> PAGEREF _Toc233140917 \h </w:instrText>
         </w:r>
         <w:r>
           <w:rPr>
@@ -898,7 +898,7 @@
           <w:lang w:val="en-HR" w:eastAsia="en-GB"/>
         </w:rPr>
       </w:pPr>
-      <w:hyperlink w:anchor="_Toc233135230" w:history="1">
+      <w:hyperlink w:anchor="_Toc233140918" w:history="1">
         <w:r>
           <w:rPr>
             <w:rStyle w:val="Hyperlink"/>
@@ -941,7 +941,7 @@
             <w:noProof/>
             <w:webHidden/>
           </w:rPr>
-          <w:instrText xml:space="preserve"> PAGEREF _Toc233135230 \h </w:instrText>
+          <w:instrText xml:space="preserve"> PAGEREF _Toc233140918 \h </w:instrText>
         </w:r>
         <w:r>
           <w:rPr>
@@ -986,7 +986,7 @@
           <w:lang w:val="en-HR" w:eastAsia="en-GB"/>
         </w:rPr>
       </w:pPr>
-      <w:hyperlink w:anchor="_Toc233135231" w:history="1">
+      <w:hyperlink w:anchor="_Toc233140919" w:history="1">
         <w:r>
           <w:rPr>
             <w:rStyle w:val="Hyperlink"/>
@@ -1029,7 +1029,7 @@
             <w:noProof/>
             <w:webHidden/>
           </w:rPr>
-          <w:instrText xml:space="preserve"> PAGEREF _Toc233135231 \h </w:instrText>
+          <w:instrText xml:space="preserve"> PAGEREF _Toc233140919 \h </w:instrText>
         </w:r>
         <w:r>
           <w:rPr>
@@ -1074,7 +1074,7 @@
           <w:lang w:val="en-HR" w:eastAsia="en-GB"/>
         </w:rPr>
       </w:pPr>
-      <w:hyperlink w:anchor="_Toc233135232" w:history="1">
+      <w:hyperlink w:anchor="_Toc233140920" w:history="1">
         <w:r>
           <w:rPr>
             <w:rStyle w:val="Hyperlink"/>
@@ -1117,7 +1117,7 @@
             <w:noProof/>
             <w:webHidden/>
           </w:rPr>
-          <w:instrText xml:space="preserve"> PAGEREF _Toc233135232 \h </w:instrText>
+          <w:instrText xml:space="preserve"> PAGEREF _Toc233140920 \h </w:instrText>
         </w:r>
         <w:r>
           <w:rPr>
@@ -1162,7 +1162,7 @@
           <w:lang w:val="en-HR" w:eastAsia="en-GB"/>
         </w:rPr>
       </w:pPr>
-      <w:hyperlink w:anchor="_Toc233135233" w:history="1">
+      <w:hyperlink w:anchor="_Toc233140921" w:history="1">
         <w:r>
           <w:rPr>
             <w:rStyle w:val="Hyperlink"/>
@@ -1205,7 +1205,7 @@
             <w:noProof/>
             <w:webHidden/>
           </w:rPr>
-          <w:instrText xml:space="preserve"> PAGEREF _Toc233135233 \h </w:instrText>
+          <w:instrText xml:space="preserve"> PAGEREF _Toc233140921 \h </w:instrText>
         </w:r>
         <w:r>
           <w:rPr>
@@ -1250,7 +1250,7 @@
           <w:lang w:val="en-HR" w:eastAsia="en-GB"/>
         </w:rPr>
       </w:pPr>
-      <w:hyperlink w:anchor="_Toc233135234" w:history="1">
+      <w:hyperlink w:anchor="_Toc233140922" w:history="1">
         <w:r>
           <w:rPr>
             <w:rStyle w:val="Hyperlink"/>
@@ -1293,7 +1293,7 @@
             <w:noProof/>
             <w:webHidden/>
           </w:rPr>
-          <w:instrText xml:space="preserve"> PAGEREF _Toc233135234 \h </w:instrText>
+          <w:instrText xml:space="preserve"> PAGEREF _Toc233140922 \h </w:instrText>
         </w:r>
         <w:r>
           <w:rPr>
@@ -1313,7 +1313,7 @@
             <w:noProof/>
             <w:webHidden/>
           </w:rPr>
-          <w:t>9</w:t>
+          <w:t>10</w:t>
         </w:r>
         <w:r>
           <w:rPr>
@@ -1338,7 +1338,7 @@
           <w:lang w:val="en-HR" w:eastAsia="en-GB"/>
         </w:rPr>
       </w:pPr>
-      <w:hyperlink w:anchor="_Toc233135235" w:history="1">
+      <w:hyperlink w:anchor="_Toc233140923" w:history="1">
         <w:r>
           <w:rPr>
             <w:rStyle w:val="Hyperlink"/>
@@ -1381,7 +1381,7 @@
             <w:noProof/>
             <w:webHidden/>
           </w:rPr>
-          <w:instrText xml:space="preserve"> PAGEREF _Toc233135235 \h </w:instrText>
+          <w:instrText xml:space="preserve"> PAGEREF _Toc233140923 \h </w:instrText>
         </w:r>
         <w:r>
           <w:rPr>
@@ -1401,7 +1401,7 @@
             <w:noProof/>
             <w:webHidden/>
           </w:rPr>
-          <w:t>10</w:t>
+          <w:t>11</w:t>
         </w:r>
         <w:r>
           <w:rPr>
@@ -1426,7 +1426,7 @@
           <w:lang w:val="en-HR" w:eastAsia="en-GB"/>
         </w:rPr>
       </w:pPr>
-      <w:hyperlink w:anchor="_Toc233135236" w:history="1">
+      <w:hyperlink w:anchor="_Toc233140924" w:history="1">
         <w:r>
           <w:rPr>
             <w:rStyle w:val="Hyperlink"/>
@@ -1469,7 +1469,7 @@
             <w:noProof/>
             <w:webHidden/>
           </w:rPr>
-          <w:instrText xml:space="preserve"> PAGEREF _Toc233135236 \h </w:instrText>
+          <w:instrText xml:space="preserve"> PAGEREF _Toc233140924 \h </w:instrText>
         </w:r>
         <w:r>
           <w:rPr>
@@ -1489,7 +1489,7 @@
             <w:noProof/>
             <w:webHidden/>
           </w:rPr>
-          <w:t>11</w:t>
+          <w:t>12</w:t>
         </w:r>
         <w:r>
           <w:rPr>
@@ -1514,7 +1514,7 @@
           <w:lang w:val="en-HR" w:eastAsia="en-GB"/>
         </w:rPr>
       </w:pPr>
-      <w:hyperlink w:anchor="_Toc233135237" w:history="1">
+      <w:hyperlink w:anchor="_Toc233140925" w:history="1">
         <w:r>
           <w:rPr>
             <w:rStyle w:val="Hyperlink"/>
@@ -1557,7 +1557,7 @@
             <w:noProof/>
             <w:webHidden/>
           </w:rPr>
-          <w:instrText xml:space="preserve"> PAGEREF _Toc233135237 \h </w:instrText>
+          <w:instrText xml:space="preserve"> PAGEREF _Toc233140925 \h </w:instrText>
         </w:r>
         <w:r>
           <w:rPr>
@@ -1577,7 +1577,7 @@
             <w:noProof/>
             <w:webHidden/>
           </w:rPr>
-          <w:t>13</w:t>
+          <w:t>14</w:t>
         </w:r>
         <w:r>
           <w:rPr>
@@ -1602,7 +1602,7 @@
           <w:lang w:val="en-HR" w:eastAsia="en-GB"/>
         </w:rPr>
       </w:pPr>
-      <w:hyperlink w:anchor="_Toc233135238" w:history="1">
+      <w:hyperlink w:anchor="_Toc233140926" w:history="1">
         <w:r>
           <w:rPr>
             <w:rStyle w:val="Hyperlink"/>
@@ -1645,7 +1645,7 @@
             <w:noProof/>
             <w:webHidden/>
           </w:rPr>
-          <w:instrText xml:space="preserve"> PAGEREF _Toc233135238 \h </w:instrText>
+          <w:instrText xml:space="preserve"> PAGEREF _Toc233140926 \h </w:instrText>
         </w:r>
         <w:r>
           <w:rPr>
@@ -1665,7 +1665,7 @@
             <w:noProof/>
             <w:webHidden/>
           </w:rPr>
-          <w:t>14</w:t>
+          <w:t>16</w:t>
         </w:r>
         <w:r>
           <w:rPr>
@@ -1689,7 +1689,7 @@
           <w:lang w:val="en-HR" w:eastAsia="en-GB"/>
         </w:rPr>
       </w:pPr>
-      <w:hyperlink w:anchor="_Toc233135239" w:history="1">
+      <w:hyperlink w:anchor="_Toc233140927" w:history="1">
         <w:r>
           <w:rPr>
             <w:rStyle w:val="Hyperlink"/>
@@ -1716,7 +1716,7 @@
             <w:noProof/>
             <w:webHidden/>
           </w:rPr>
-          <w:instrText xml:space="preserve"> PAGEREF _Toc233135239 \h </w:instrText>
+          <w:instrText xml:space="preserve"> PAGEREF _Toc233140927 \h </w:instrText>
         </w:r>
         <w:r>
           <w:rPr>
@@ -1736,7 +1736,7 @@
             <w:noProof/>
             <w:webHidden/>
           </w:rPr>
-          <w:t>15</w:t>
+          <w:t>17</w:t>
         </w:r>
         <w:r>
           <w:rPr>
@@ -1760,7 +1760,7 @@
           <w:lang w:val="en-HR" w:eastAsia="en-GB"/>
         </w:rPr>
       </w:pPr>
-      <w:hyperlink w:anchor="_Toc233135240" w:history="1">
+      <w:hyperlink w:anchor="_Toc233140928" w:history="1">
         <w:r>
           <w:rPr>
             <w:rStyle w:val="Hyperlink"/>
@@ -1787,7 +1787,7 @@
             <w:noProof/>
             <w:webHidden/>
           </w:rPr>
-          <w:instrText xml:space="preserve"> PAGEREF _Toc233135240 \h </w:instrText>
+          <w:instrText xml:space="preserve"> PAGEREF _Toc233140928 \h </w:instrText>
         </w:r>
         <w:r>
           <w:rPr>
@@ -1807,7 +1807,7 @@
             <w:noProof/>
             <w:webHidden/>
           </w:rPr>
-          <w:t>16</w:t>
+          <w:t>18</w:t>
         </w:r>
         <w:r>
           <w:rPr>
@@ -1834,7 +1834,7 @@
           <w:numId w:val="0"/>
         </w:numPr>
       </w:pPr>
-      <w:bookmarkStart w:id="0" w:name="_Toc233135223"/>
+      <w:bookmarkStart w:id="0" w:name="_Toc233140911"/>
       <w:r>
         <w:lastRenderedPageBreak/>
         <w:t>Uvod</w:t>
@@ -1859,10 +1859,18 @@
     </w:p>
     <w:p>
       <w:pPr>
+        <w:jc w:val="left"/>
+      </w:pPr>
+      <w:r>
+        <w:t>Fantasy ligu odabrao sam jer pratim nogomet pa mi je domena bliska, a pokazala se i kao zgodan primjer za dokumentni model: podaci su prirodno ugniježđeni pa sam na konkretnom slučaju mogao isprobati kako MongoDB rješava stvari koje sam dotad radio uglavnom u relacijskim bazama.</w:t>
+      </w:r>
+    </w:p>
+    <w:p>
+      <w:pPr>
         <w:pStyle w:val="Heading1"/>
         <w:jc w:val="left"/>
       </w:pPr>
-      <w:bookmarkStart w:id="1" w:name="_Toc233135224"/>
+      <w:bookmarkStart w:id="1" w:name="_Toc233140912"/>
       <w:r>
         <w:lastRenderedPageBreak/>
         <w:t>Opis projektnog zadatka</w:t>
@@ -1940,7 +1948,7 @@
         <w:pStyle w:val="Heading1"/>
         <w:jc w:val="left"/>
       </w:pPr>
-      <w:bookmarkStart w:id="2" w:name="_Toc233135225"/>
+      <w:bookmarkStart w:id="2" w:name="_Toc233140913"/>
       <w:r>
         <w:lastRenderedPageBreak/>
         <w:t>Razvojne tehnologije</w:t>
@@ -1951,7 +1959,7 @@
       <w:pPr>
         <w:pStyle w:val="Heading2"/>
       </w:pPr>
-      <w:bookmarkStart w:id="3" w:name="_Toc233135226"/>
+      <w:bookmarkStart w:id="3" w:name="_Toc233140914"/>
       <w:r>
         <w:t>MongoDB - dokumentna baza podataka</w:t>
       </w:r>
@@ -2011,7 +2019,7 @@
         <w:pStyle w:val="Heading2"/>
         <w:jc w:val="left"/>
       </w:pPr>
-      <w:bookmarkStart w:id="4" w:name="_Toc233135227"/>
+      <w:bookmarkStart w:id="4" w:name="_Toc233140915"/>
       <w:r>
         <w:t>Poslužiteljski i klijentski dio</w:t>
       </w:r>
@@ -2060,12 +2068,6 @@
         <w:gridCol w:w="4000"/>
       </w:tblGrid>
       <w:tr>
-        <w:tblPrEx>
-          <w:tblCellMar>
-            <w:top w:w="0" w:type="dxa"/>
-            <w:bottom w:w="0" w:type="dxa"/>
-          </w:tblCellMar>
-        </w:tblPrEx>
         <w:trPr>
           <w:jc w:val="center"/>
         </w:trPr>
@@ -2146,12 +2148,6 @@
         </w:tc>
       </w:tr>
       <w:tr>
-        <w:tblPrEx>
-          <w:tblCellMar>
-            <w:top w:w="0" w:type="dxa"/>
-            <w:bottom w:w="0" w:type="dxa"/>
-          </w:tblCellMar>
-        </w:tblPrEx>
         <w:trPr>
           <w:jc w:val="center"/>
         </w:trPr>
@@ -2228,24 +2224,12 @@
               <w:jc w:val="left"/>
             </w:pPr>
             <w:r>
-              <w:t>Pohrana</w:t>
-            </w:r>
-            <w:r>
-              <w:t xml:space="preserve"> </w:t>
-            </w:r>
-            <w:r>
-              <w:t>dokumenata, indeksi, agregacije, transakcije</w:t>
+              <w:t>Pohrana dokumenata, indeksi, agregacije, transakcije</w:t>
             </w:r>
           </w:p>
         </w:tc>
       </w:tr>
       <w:tr>
-        <w:tblPrEx>
-          <w:tblCellMar>
-            <w:top w:w="0" w:type="dxa"/>
-            <w:bottom w:w="0" w:type="dxa"/>
-          </w:tblCellMar>
-        </w:tblPrEx>
         <w:trPr>
           <w:jc w:val="center"/>
         </w:trPr>
@@ -2326,12 +2310,6 @@
         </w:tc>
       </w:tr>
       <w:tr>
-        <w:tblPrEx>
-          <w:tblCellMar>
-            <w:top w:w="0" w:type="dxa"/>
-            <w:bottom w:w="0" w:type="dxa"/>
-          </w:tblCellMar>
-        </w:tblPrEx>
         <w:trPr>
           <w:jc w:val="center"/>
         </w:trPr>
@@ -2412,12 +2390,6 @@
         </w:tc>
       </w:tr>
       <w:tr>
-        <w:tblPrEx>
-          <w:tblCellMar>
-            <w:top w:w="0" w:type="dxa"/>
-            <w:bottom w:w="0" w:type="dxa"/>
-          </w:tblCellMar>
-        </w:tblPrEx>
         <w:trPr>
           <w:jc w:val="center"/>
         </w:trPr>
@@ -2512,7 +2484,7 @@
         <w:pStyle w:val="Heading1"/>
         <w:jc w:val="left"/>
       </w:pPr>
-      <w:bookmarkStart w:id="5" w:name="_Toc233135228"/>
+      <w:bookmarkStart w:id="5" w:name="_Toc233140916"/>
       <w:r>
         <w:lastRenderedPageBreak/>
         <w:t>Podatkovni model</w:t>
@@ -2524,7 +2496,7 @@
         <w:pStyle w:val="Heading2"/>
         <w:jc w:val="left"/>
       </w:pPr>
-      <w:bookmarkStart w:id="6" w:name="_Toc233135229"/>
+      <w:bookmarkStart w:id="6" w:name="_Toc233140917"/>
       <w:r>
         <w:t>Kolekcije i veze</w:t>
       </w:r>
@@ -2568,7 +2540,7 @@
         <w:t>leagueId</w:t>
       </w:r>
       <w:r>
-        <w:t>), a dijelom ugnježđivanjem (engl. embedding), ovisno o tome kako se podaci najčešće čitaju. Pregled kolekcija dan je u tablici 2.</w:t>
+        <w:t>), a dijelom ugnježđivanjem (engl. embedding), ovisno o tome kako se podaci najčešće čitaju. Pregled kolekcija dan je u tablici 2. Nakon pokretanja skripte za punjenje baza sadrži 50 igrača, 3 korisnika, jednu ligu i 2 momčadi.</w:t>
       </w:r>
     </w:p>
     <w:tbl>
@@ -2595,12 +2567,6 @@
         <w:gridCol w:w="3200"/>
       </w:tblGrid>
       <w:tr>
-        <w:tblPrEx>
-          <w:tblCellMar>
-            <w:top w:w="0" w:type="dxa"/>
-            <w:bottom w:w="0" w:type="dxa"/>
-          </w:tblCellMar>
-        </w:tblPrEx>
         <w:trPr>
           <w:jc w:val="center"/>
         </w:trPr>
@@ -2681,12 +2647,6 @@
         </w:tc>
       </w:tr>
       <w:tr>
-        <w:tblPrEx>
-          <w:tblCellMar>
-            <w:top w:w="0" w:type="dxa"/>
-            <w:bottom w:w="0" w:type="dxa"/>
-          </w:tblCellMar>
-        </w:tblPrEx>
         <w:trPr>
           <w:jc w:val="center"/>
         </w:trPr>
@@ -2767,12 +2727,6 @@
         </w:tc>
       </w:tr>
       <w:tr>
-        <w:tblPrEx>
-          <w:tblCellMar>
-            <w:top w:w="0" w:type="dxa"/>
-            <w:bottom w:w="0" w:type="dxa"/>
-          </w:tblCellMar>
-        </w:tblPrEx>
         <w:trPr>
           <w:jc w:val="center"/>
         </w:trPr>
@@ -2853,12 +2807,6 @@
         </w:tc>
       </w:tr>
       <w:tr>
-        <w:tblPrEx>
-          <w:tblCellMar>
-            <w:top w:w="0" w:type="dxa"/>
-            <w:bottom w:w="0" w:type="dxa"/>
-          </w:tblCellMar>
-        </w:tblPrEx>
         <w:trPr>
           <w:jc w:val="center"/>
         </w:trPr>
@@ -2939,12 +2887,6 @@
         </w:tc>
       </w:tr>
       <w:tr>
-        <w:tblPrEx>
-          <w:tblCellMar>
-            <w:top w:w="0" w:type="dxa"/>
-            <w:bottom w:w="0" w:type="dxa"/>
-          </w:tblCellMar>
-        </w:tblPrEx>
         <w:trPr>
           <w:jc w:val="center"/>
         </w:trPr>
@@ -3025,12 +2967,6 @@
         </w:tc>
       </w:tr>
       <w:tr>
-        <w:tblPrEx>
-          <w:tblCellMar>
-            <w:top w:w="0" w:type="dxa"/>
-            <w:bottom w:w="0" w:type="dxa"/>
-          </w:tblCellMar>
-        </w:tblPrEx>
         <w:trPr>
           <w:jc w:val="center"/>
         </w:trPr>
@@ -3111,12 +3047,6 @@
         </w:tc>
       </w:tr>
       <w:tr>
-        <w:tblPrEx>
-          <w:tblCellMar>
-            <w:top w:w="0" w:type="dxa"/>
-            <w:bottom w:w="0" w:type="dxa"/>
-          </w:tblCellMar>
-        </w:tblPrEx>
         <w:trPr>
           <w:jc w:val="center"/>
         </w:trPr>
@@ -3210,7 +3140,7 @@
         <w:pStyle w:val="Heading2"/>
         <w:jc w:val="left"/>
       </w:pPr>
-      <w:bookmarkStart w:id="7" w:name="_Toc233135230"/>
+      <w:bookmarkStart w:id="7" w:name="_Toc233140918"/>
       <w:r>
         <w:t>Primjer dokumenta i denormalizacija</w:t>
       </w:r>
@@ -3272,6 +3202,7 @@
         <w:pStyle w:val="Kd"/>
       </w:pPr>
       <w:r>
+        <w:lastRenderedPageBreak/>
         <w:t xml:space="preserve">  "club": "FC Rijeka",          // denormalizirano (naziv kluba)</w:t>
       </w:r>
     </w:p>
@@ -3280,7 +3211,6 @@
         <w:pStyle w:val="Kd"/>
       </w:pPr>
       <w:r>
-        <w:lastRenderedPageBreak/>
         <w:t xml:space="preserve">  "price": 8.5,</w:t>
       </w:r>
     </w:p>
@@ -3477,7 +3407,7 @@
         <w:pStyle w:val="Heading2"/>
         <w:jc w:val="left"/>
       </w:pPr>
-      <w:bookmarkStart w:id="8" w:name="_Toc233135231"/>
+      <w:bookmarkStart w:id="8" w:name="_Toc233140919"/>
       <w:r>
         <w:t>Indeksi</w:t>
       </w:r>
@@ -3542,6 +3472,7 @@
         <w:pStyle w:val="Kd"/>
       </w:pPr>
       <w:r>
+        <w:lastRenderedPageBreak/>
         <w:t>db.fantasyTeams.createIndex({ leagueId: 1, totalPoints: -1 })</w:t>
       </w:r>
     </w:p>
@@ -3558,7 +3489,6 @@
         <w:jc w:val="left"/>
       </w:pPr>
       <w:r>
-        <w:lastRenderedPageBreak/>
         <w:t xml:space="preserve">Uz indekse za pretraživanje koriste se i jedinstveni (engl. unique) indeksi na </w:t>
       </w:r>
       <w:r>
@@ -3589,7 +3519,7 @@
         <w:pStyle w:val="Heading1"/>
         <w:jc w:val="left"/>
       </w:pPr>
-      <w:bookmarkStart w:id="9" w:name="_Toc233135232"/>
+      <w:bookmarkStart w:id="9" w:name="_Toc233140920"/>
       <w:r>
         <w:lastRenderedPageBreak/>
         <w:t>Realizacija MongoDB koncepata</w:t>
@@ -3620,7 +3550,7 @@
         <w:pStyle w:val="Heading2"/>
         <w:jc w:val="left"/>
       </w:pPr>
-      <w:bookmarkStart w:id="10" w:name="_Toc233135233"/>
+      <w:bookmarkStart w:id="10" w:name="_Toc233140921"/>
       <w:r>
         <w:t>CRUD operacije</w:t>
       </w:r>
@@ -3802,7 +3732,7 @@
           <w:noProof/>
         </w:rPr>
         <w:lastRenderedPageBreak/>
-        <w:pict w14:anchorId="7565D731">
+        <w:pict w14:anchorId="4AFA6BF9">
           <v:shapetype id="_x0000_t75" coordsize="21600,21600" o:spt="75" o:preferrelative="t" path="m@4@5l@4@11@9@11@9@5xe" filled="f" stroked="f">
             <v:stroke joinstyle="miter"/>
             <v:formulas>
@@ -3822,15 +3752,13 @@
             <v:path o:extrusionok="f" gradientshapeok="t" o:connecttype="rect"/>
             <o:lock v:ext="edit" aspectratio="t"/>
           </v:shapetype>
-          <v:shape id="Picture 1" o:spid="_x0000_i1030" type="#_x0000_t75" style="width:438.95pt;height:261.85pt;visibility:visible;mso-wrap-style:square">
+          <v:shape id="Picture 1" o:spid="_x0000_i1030" type="#_x0000_t75" alt="" style="width:438.95pt;height:261.85pt;visibility:visible;mso-wrap-style:square;mso-width-percent:0;mso-height-percent:0;mso-width-percent:0;mso-height-percent:0">
             <v:imagedata r:id="rId9" o:title=""/>
           </v:shape>
         </w:pict>
       </w:r>
       <w:r>
         <w:br/>
-      </w:r>
-      <w:r>
         <w:t>Sl. 1. Popis igrača s CRUD operacijama</w:t>
       </w:r>
     </w:p>
@@ -3839,7 +3767,7 @@
         <w:pStyle w:val="Heading2"/>
         <w:jc w:val="left"/>
       </w:pPr>
-      <w:bookmarkStart w:id="11" w:name="_Toc233135234"/>
+      <w:bookmarkStart w:id="11" w:name="_Toc233140922"/>
       <w:r>
         <w:t>Napredno pretraživanje</w:t>
       </w:r>
@@ -4081,16 +4009,14 @@
         <w:rPr>
           <w:noProof/>
         </w:rPr>
-        <w:pict w14:anchorId="40D095BF">
-          <v:shape id="Picture 2" o:spid="_x0000_i1029" type="#_x0000_t75" style="width:439.45pt;height:157.85pt;visibility:visible;mso-wrap-style:square">
+        <w:pict w14:anchorId="4639592D">
+          <v:shape id="Picture 2" o:spid="_x0000_i1029" type="#_x0000_t75" alt="" style="width:439.45pt;height:157.85pt;visibility:visible;mso-wrap-style:square;mso-width-percent:0;mso-height-percent:0;mso-width-percent:0;mso-height-percent:0">
             <v:imagedata r:id="rId10" o:title=""/>
           </v:shape>
         </w:pict>
       </w:r>
       <w:r>
         <w:br/>
-      </w:r>
-      <w:r>
         <w:t>Sl. 2. Napredno pretraživanje s prikazom korištenja indeksa</w:t>
       </w:r>
     </w:p>
@@ -4099,7 +4025,7 @@
         <w:pStyle w:val="Heading2"/>
         <w:jc w:val="left"/>
       </w:pPr>
-      <w:bookmarkStart w:id="12" w:name="_Toc233135235"/>
+      <w:bookmarkStart w:id="12" w:name="_Toc233140923"/>
       <w:r>
         <w:t>Agregacijski pipeline</w:t>
       </w:r>
@@ -4267,7 +4193,11 @@
         <w:t>$group</w:t>
       </w:r>
       <w:r>
-        <w:t xml:space="preserve">) te zbroj bodova kroz odigrana kola, gdje se ugniježđeno polje </w:t>
+        <w:t xml:space="preserve">) te zbroj bodova kroz odigrana kola, gdje </w:t>
+      </w:r>
+      <w:r>
+        <w:lastRenderedPageBreak/>
+        <w:t xml:space="preserve">se ugniježđeno polje </w:t>
       </w:r>
       <w:r>
         <w:rPr>
@@ -4289,11 +4219,7 @@
         <w:t>$unwind</w:t>
       </w:r>
       <w:r>
-        <w:t xml:space="preserve">, grupira po </w:t>
-      </w:r>
-      <w:r>
-        <w:lastRenderedPageBreak/>
-        <w:t>igraču (</w:t>
+        <w:t>, grupira po igraču (</w:t>
       </w:r>
       <w:r>
         <w:rPr>
@@ -4329,16 +4255,14 @@
         <w:rPr>
           <w:noProof/>
         </w:rPr>
-        <w:pict w14:anchorId="11BF7DB5">
-          <v:shape id="Picture 3" o:spid="_x0000_i1028" type="#_x0000_t75" style="width:439.45pt;height:170.15pt;visibility:visible;mso-wrap-style:square">
+        <w:pict w14:anchorId="14E02C66">
+          <v:shape id="Picture 3" o:spid="_x0000_i1028" type="#_x0000_t75" alt="" style="width:439.45pt;height:170.15pt;visibility:visible;mso-wrap-style:square;mso-width-percent:0;mso-height-percent:0;mso-width-percent:0;mso-height-percent:0">
             <v:imagedata r:id="rId11" o:title=""/>
           </v:shape>
         </w:pict>
       </w:r>
       <w:r>
         <w:br/>
-      </w:r>
-      <w:r>
         <w:t>Sl. 3. Statistike i ljestvica lige dobivene agregacijskim pipelineom</w:t>
       </w:r>
     </w:p>
@@ -4347,7 +4271,7 @@
         <w:pStyle w:val="Heading2"/>
         <w:jc w:val="left"/>
       </w:pPr>
-      <w:bookmarkStart w:id="13" w:name="_Toc233135236"/>
+      <w:bookmarkStart w:id="13" w:name="_Toc233140924"/>
       <w:r>
         <w:t>Transakcije</w:t>
       </w:r>
@@ -4490,6 +4414,18 @@
         <w:jc w:val="left"/>
       </w:pPr>
       <w:r>
+        <w:t xml:space="preserve">Pri izradi ovog dijela naišao sam na prepreku koju isprva nisam očekivao: transfer mi je stalno pucao s pogreškom o transakcijskim brojevima. Ispostavilo se da samostalni </w:t>
+      </w:r>
+      <w:r>
+        <w:lastRenderedPageBreak/>
+        <w:t>mongod kakav sam pokrenuo lokalno uopće ne podržava višedokumentne transakcije, nego ih dopušta samo replica set. Zato sam lokalni mongod morao prebaciti u jednočvorni replica set rs0, nakon čega je ista funkcija proradila bez ijedne izmjene u kodu.</w:t>
+      </w:r>
+    </w:p>
+    <w:p>
+      <w:pPr>
+        <w:jc w:val="left"/>
+      </w:pPr>
+      <w:r>
         <w:t xml:space="preserve">Važna napomena: višedokumentne transakcije u MongoDB-u zahtijevaju replica set - samostalni (engl. standalone) </w:t>
       </w:r>
       <w:r>
@@ -4512,13 +4448,7 @@
         <w:t>mongod</w:t>
       </w:r>
       <w:r>
-        <w:t xml:space="preserve"> je stoga pokrenut</w:t>
-      </w:r>
-      <w:r>
-        <w:t xml:space="preserve"> </w:t>
-      </w:r>
-      <w:r>
-        <w:t xml:space="preserve">kao jednočvorni replica set </w:t>
+        <w:t xml:space="preserve"> je stoga pokrenut kao jednočvorni replica set </w:t>
       </w:r>
       <w:r>
         <w:rPr>
@@ -4529,10 +4459,7 @@
         <w:t>rs0</w:t>
       </w:r>
       <w:r>
-        <w:t>. U konfiguraciju</w:t>
-      </w:r>
-      <w:r>
-        <w:t xml:space="preserve"> </w:t>
+        <w:t xml:space="preserve">. U konfiguraciju </w:t>
       </w:r>
       <w:r>
         <w:rPr>
@@ -4551,7 +4478,6 @@
         <w:pStyle w:val="Kd"/>
       </w:pPr>
       <w:r>
-        <w:lastRenderedPageBreak/>
         <w:t>replication:</w:t>
       </w:r>
     </w:p>
@@ -4579,10 +4505,7 @@
         <w:t>rs.initiate(...)</w:t>
       </w:r>
       <w:r>
-        <w:t>, a spojni niz postaje</w:t>
-      </w:r>
-      <w:r>
-        <w:t xml:space="preserve"> </w:t>
+        <w:t xml:space="preserve">, a spojni niz postaje </w:t>
       </w:r>
       <w:r>
         <w:rPr>
@@ -4607,16 +4530,14 @@
         <w:rPr>
           <w:noProof/>
         </w:rPr>
-        <w:pict w14:anchorId="41D67CC2">
-          <v:shape id="Picture 4" o:spid="_x0000_i1027" type="#_x0000_t75" style="width:438.95pt;height:228.8pt;visibility:visible;mso-wrap-style:square">
+        <w:pict w14:anchorId="6327BE0C">
+          <v:shape id="Picture 4" o:spid="_x0000_i1027" type="#_x0000_t75" alt="" style="width:438.95pt;height:228.8pt;visibility:visible;mso-wrap-style:square;mso-width-percent:0;mso-height-percent:0;mso-width-percent:0;mso-height-percent:0">
             <v:imagedata r:id="rId12" o:title=""/>
           </v:shape>
         </w:pict>
       </w:r>
       <w:r>
         <w:br/>
-      </w:r>
-      <w:r>
         <w:t>Sl. 4. Transfer igrača izveden kao višedokumentna transakcija</w:t>
       </w:r>
     </w:p>
@@ -4625,12 +4546,31 @@
         <w:pStyle w:val="Heading1"/>
         <w:jc w:val="left"/>
       </w:pPr>
-      <w:bookmarkStart w:id="14" w:name="_Toc233135237"/>
+      <w:bookmarkStart w:id="14" w:name="_Toc233140925"/>
       <w:r>
         <w:lastRenderedPageBreak/>
         <w:t>Opis aplikacije</w:t>
       </w:r>
       <w:bookmarkEnd w:id="14"/>
+    </w:p>
+    <w:p>
+      <w:pPr>
+        <w:jc w:val="left"/>
+      </w:pPr>
+      <w:r>
+        <w:t xml:space="preserve">Za demonstraciju aplikacija dolazi s deterministički generiranim demo podacima: skripta za punjenje baze ubacuje 50 igrača (6 vratara, 16 obrambenih, 16 veznih i 12 napadača), 3 korisnika, jednu ligu te 2 momčadi i 3 kola (od kojih su dva odigrana). Toliko podataka dovoljno je da svaka stranica ima smislen sadržaj za prikaz. Cjeloviti izvorni kod projekta dostupan je u javnom GitHub repozitoriju na adresi </w:t>
+      </w:r>
+      <w:hyperlink r:id="rId13" w:history="1">
+        <w:r>
+          <w:rPr>
+            <w:rStyle w:val="Hyperlink"/>
+          </w:rPr>
+          <w:t>https://github.com/mcovic/RiNBP_projekt</w:t>
+        </w:r>
+      </w:hyperlink>
+      <w:r>
+        <w:t>.</w:t>
+      </w:r>
     </w:p>
     <w:p>
       <w:pPr>
@@ -4659,13 +4599,7 @@
         <w:t>npm start</w:t>
       </w:r>
       <w:r>
-        <w:t xml:space="preserve">, nakon čega je dostupna na </w:t>
-      </w:r>
-      <w:r>
-        <w:t xml:space="preserve">lokalnoj </w:t>
-      </w:r>
-      <w:r>
-        <w:t xml:space="preserve">adresi </w:t>
+        <w:t xml:space="preserve">, nakon čega je dostupna na lokalnoj adresi </w:t>
       </w:r>
       <w:r>
         <w:rPr>
@@ -4692,16 +4626,14 @@
         <w:rPr>
           <w:noProof/>
         </w:rPr>
-        <w:pict w14:anchorId="210E44ED">
-          <v:shape id="Picture 5" o:spid="_x0000_i1026" type="#_x0000_t75" style="width:439.45pt;height:142.95pt;visibility:visible;mso-wrap-style:square">
-            <v:imagedata r:id="rId13" o:title=""/>
+        <w:pict w14:anchorId="0FC65680">
+          <v:shape id="Picture 5" o:spid="_x0000_i1026" type="#_x0000_t75" alt="" style="width:439.45pt;height:142.95pt;visibility:visible;mso-wrap-style:square;mso-width-percent:0;mso-height-percent:0;mso-width-percent:0;mso-height-percent:0">
+            <v:imagedata r:id="rId14" o:title=""/>
           </v:shape>
         </w:pict>
       </w:r>
       <w:r>
         <w:br/>
-      </w:r>
-      <w:r>
         <w:t>Sl. 5. Početna stranica aplikacije</w:t>
       </w:r>
     </w:p>
@@ -4747,16 +4679,14 @@
         <w:rPr>
           <w:noProof/>
         </w:rPr>
-        <w:pict w14:anchorId="084F11DC">
-          <v:shape id="Picture 6" o:spid="_x0000_i1025" type="#_x0000_t75" style="width:440pt;height:275.75pt;visibility:visible;mso-wrap-style:square">
-            <v:imagedata r:id="rId14" o:title=""/>
+        <w:pict w14:anchorId="49519CE9">
+          <v:shape id="Picture 6" o:spid="_x0000_i1025" type="#_x0000_t75" alt="" style="width:440pt;height:275.75pt;visibility:visible;mso-wrap-style:square;mso-width-percent:0;mso-height-percent:0;mso-width-percent:0;mso-height-percent:0">
+            <v:imagedata r:id="rId15" o:title=""/>
           </v:shape>
         </w:pict>
       </w:r>
       <w:r>
         <w:br/>
-      </w:r>
-      <w:r>
         <w:t>Sl. 6. Prikaz momčadi s ugniježđenim igračima</w:t>
       </w:r>
     </w:p>
@@ -4765,7 +4695,7 @@
         <w:pStyle w:val="Heading1"/>
         <w:jc w:val="left"/>
       </w:pPr>
-      <w:bookmarkStart w:id="15" w:name="_Toc233135238"/>
+      <w:bookmarkStart w:id="15" w:name="_Toc233140926"/>
       <w:r>
         <w:lastRenderedPageBreak/>
         <w:t>Raspodijeljene baze podataka u oblaku - MongoDB Atlas</w:t>
@@ -4777,13 +4707,7 @@
         <w:jc w:val="left"/>
       </w:pPr>
       <w:r>
-        <w:t xml:space="preserve">Tema raspodijeljenih baza podataka u oblaku pokrivena je pokretanjem iste aplikacije na usluzi MongoDB Atlas. Atlas je upravljana (engl. managed) usluga u oblaku koja MongoDB pokreće kao replica set raspoređen preko više čvorova, čime se postižu visoka dostupnost i otpornost na kvarove. Podaci se </w:t>
-      </w:r>
-      <w:r>
-        <w:t>repliciraju</w:t>
-      </w:r>
-      <w:r>
-        <w:t xml:space="preserve"> na primarni i sekundarne čvorove, a klijent se na cluster spaja preko </w:t>
+        <w:t xml:space="preserve">Tema raspodijeljenih baza podataka u oblaku pokrivena je pokretanjem iste aplikacije na usluzi MongoDB Atlas. Atlas je upravljana (engl. managed) usluga u oblaku koja MongoDB pokreće kao replica set raspoređen preko više čvorova, čime se postižu visoka dostupnost i otpornost na kvarove. Podaci se repliciraju na primarni i sekundarne čvorove, a klijent se na cluster spaja preko </w:t>
       </w:r>
       <w:r>
         <w:rPr>
@@ -4891,7 +4815,7 @@
           <w:numId w:val="0"/>
         </w:numPr>
       </w:pPr>
-      <w:bookmarkStart w:id="16" w:name="_Toc233135239"/>
+      <w:bookmarkStart w:id="16" w:name="_Toc233140927"/>
       <w:r>
         <w:lastRenderedPageBreak/>
         <w:t>Zaključak</w:t>
@@ -4922,7 +4846,7 @@
           <w:numId w:val="0"/>
         </w:numPr>
       </w:pPr>
-      <w:bookmarkStart w:id="17" w:name="_Toc233135240"/>
+      <w:bookmarkStart w:id="17" w:name="_Toc233140928"/>
       <w:r>
         <w:lastRenderedPageBreak/>
         <w:t>Literatura</w:t>
@@ -4939,7 +4863,7 @@
       <w:r>
         <w:br/>
       </w:r>
-      <w:hyperlink r:id="rId15" w:history="1">
+      <w:hyperlink r:id="rId16" w:history="1">
         <w:r>
           <w:rPr>
             <w:rStyle w:val="Hyperlink"/>
@@ -4958,7 +4882,7 @@
       <w:r>
         <w:br/>
       </w:r>
-      <w:hyperlink r:id="rId16" w:history="1">
+      <w:hyperlink r:id="rId17" w:history="1">
         <w:r>
           <w:rPr>
             <w:rStyle w:val="Hyperlink"/>
@@ -4977,7 +4901,7 @@
       <w:r>
         <w:br/>
       </w:r>
-      <w:hyperlink r:id="rId17" w:history="1">
+      <w:hyperlink r:id="rId18" w:history="1">
         <w:r>
           <w:rPr>
             <w:rStyle w:val="Hyperlink"/>
@@ -4996,7 +4920,7 @@
       <w:r>
         <w:br/>
       </w:r>
-      <w:hyperlink r:id="rId18" w:history="1">
+      <w:hyperlink r:id="rId19" w:history="1">
         <w:r>
           <w:rPr>
             <w:rStyle w:val="Hyperlink"/>
@@ -5015,7 +4939,7 @@
       <w:r>
         <w:br/>
       </w:r>
-      <w:hyperlink r:id="rId19" w:history="1">
+      <w:hyperlink r:id="rId20" w:history="1">
         <w:r>
           <w:rPr>
             <w:rStyle w:val="Hyperlink"/>
@@ -5032,11 +4956,30 @@
         <w:t>Nastavni materijali kolegija Raspodijeljene i nerelacijske baze podataka</w:t>
       </w:r>
     </w:p>
+    <w:p>
+      <w:pPr>
+        <w:pStyle w:val="literatura"/>
+      </w:pPr>
+      <w:r>
+        <w:t>Čović, M. Fantasy liga - RiNBP projekt (izvorni kod). GitHub.</w:t>
+      </w:r>
+      <w:r>
+        <w:br/>
+      </w:r>
+      <w:hyperlink r:id="rId21" w:history="1">
+        <w:r>
+          <w:rPr>
+            <w:rStyle w:val="Hyperlink"/>
+          </w:rPr>
+          <w:t>https://github.com/mcovic/RiNBP_projekt</w:t>
+        </w:r>
+      </w:hyperlink>
+    </w:p>
     <w:sectPr>
-      <w:headerReference w:type="default" r:id="rId20"/>
-      <w:footerReference w:type="default" r:id="rId21"/>
-      <w:headerReference w:type="first" r:id="rId22"/>
-      <w:footerReference w:type="first" r:id="rId23"/>
+      <w:headerReference w:type="default" r:id="rId22"/>
+      <w:footerReference w:type="default" r:id="rId23"/>
+      <w:headerReference w:type="first" r:id="rId24"/>
+      <w:footerReference w:type="first" r:id="rId25"/>
       <w:pgSz w:w="11906" w:h="16838"/>
       <w:pgMar w:top="1418" w:right="1418" w:bottom="1418" w:left="1701" w:header="851" w:footer="567" w:gutter="0"/>
       <w:pgNumType w:start="1"/>

</xml_diff>